<commit_message>
Create Directory Matteo & Update DiarioMatteo-08.05.docx
</commit_message>
<xml_diff>
--- a/1_Documentazione/DiarioMatteo-08.05.docx
+++ b/1_Documentazione/DiarioMatteo-08.05.docx
@@ -305,13 +305,33 @@
               </w:rPr>
               <w:t>SettingsPage</w:t>
             </w:r>
+            <w:r>
+              <w:rPr>
+                <w:rFonts w:ascii="Arial" w:hAnsi="Arial" w:cs="Arial"/>
+              </w:rPr>
+              <w:t>.xaml</w:t>
+            </w:r>
             <w:proofErr w:type="spellEnd"/>
             <w:r>
               <w:rPr>
                 <w:rFonts w:ascii="Arial" w:hAnsi="Arial" w:cs="Arial"/>
               </w:rPr>
-              <w:t xml:space="preserve"> con Account</w:t>
+              <w:t xml:space="preserve"> con </w:t>
             </w:r>
+            <w:proofErr w:type="spellStart"/>
+            <w:r>
+              <w:rPr>
+                <w:rFonts w:ascii="Arial" w:hAnsi="Arial" w:cs="Arial"/>
+              </w:rPr>
+              <w:t>Account</w:t>
+            </w:r>
+            <w:r>
+              <w:rPr>
+                <w:rFonts w:ascii="Arial" w:hAnsi="Arial" w:cs="Arial"/>
+              </w:rPr>
+              <w:t>.xaml</w:t>
+            </w:r>
+            <w:proofErr w:type="spellEnd"/>
           </w:p>
           <w:p>
             <w:pPr>
@@ -324,6 +344,26 @@
                 <w:rFonts w:ascii="Arial" w:hAnsi="Arial" w:cs="Arial"/>
               </w:rPr>
             </w:pPr>
+            <w:r>
+              <w:rPr>
+                <w:rFonts w:ascii="Arial" w:hAnsi="Arial" w:cs="Arial"/>
+              </w:rPr>
+              <w:t xml:space="preserve">Miglioramento dell’aspetto di </w:t>
+            </w:r>
+            <w:proofErr w:type="spellStart"/>
+            <w:r>
+              <w:rPr>
+                <w:rFonts w:ascii="Arial" w:hAnsi="Arial" w:cs="Arial"/>
+              </w:rPr>
+              <w:t>Account</w:t>
+            </w:r>
+            <w:r>
+              <w:rPr>
+                <w:rFonts w:ascii="Arial" w:hAnsi="Arial" w:cs="Arial"/>
+              </w:rPr>
+              <w:t>.xaml</w:t>
+            </w:r>
+            <w:proofErr w:type="spellEnd"/>
           </w:p>
         </w:tc>
       </w:tr>
@@ -552,7 +592,7 @@
           </w:rPr>
           <w:id w:val="1421220160"/>
           <w14:checkbox>
-            <w14:checked w14:val="0"/>
+            <w14:checked w14:val="1"/>
             <w14:checkedState w14:val="2612" w14:font="MS Gothic"/>
             <w14:uncheckedState w14:val="2610" w14:font="MS Gothic"/>
           </w14:checkbox>
@@ -562,7 +602,7 @@
             <w:rPr>
               <w:rFonts w:ascii="MS Gothic" w:eastAsia="MS Gothic" w:hAnsi="MS Gothic" w:cs="Segoe UI Symbol" w:hint="eastAsia"/>
             </w:rPr>
-            <w:t>☐</w:t>
+            <w:t>☒</w:t>
           </w:r>
         </w:sdtContent>
       </w:sdt>
@@ -686,13 +726,34 @@
           <w:placeholder>
             <w:docPart w:val="EEDD90D491DB4FA5AD1472410DF94164"/>
           </w:placeholder>
+          <w:showingPlcHdr/>
         </w:sdtPr>
         <w:sdtContent>
           <w:r>
             <w:rPr>
-              <w:rFonts w:ascii="Arial" w:hAnsi="Arial" w:cs="Arial"/>
+              <w:rStyle w:val="Testosegnaposto"/>
+              <w:b/>
+              <w:bCs/>
             </w:rPr>
-            <w:t>Google AI</w:t>
+            <w:t xml:space="preserve">Nomi </w:t>
+          </w:r>
+          <w:proofErr w:type="gramStart"/>
+          <w:r>
+            <w:rPr>
+              <w:rStyle w:val="Testosegnaposto"/>
+              <w:b/>
+              <w:bCs/>
+            </w:rPr>
+            <w:t>AI</w:t>
+          </w:r>
+          <w:proofErr w:type="gramEnd"/>
+          <w:r>
+            <w:rPr>
+              <w:rStyle w:val="Testosegnaposto"/>
+              <w:b/>
+              <w:bCs/>
+            </w:rPr>
+            <w:t xml:space="preserve"> utilizzati</w:t>
           </w:r>
         </w:sdtContent>
       </w:sdt>
@@ -1191,8 +1252,12 @@
       </w:pPr>
     </w:p>
     <w:sectPr>
-      <w:headerReference w:type="default" r:id="rId8"/>
-      <w:footerReference w:type="default" r:id="rId9"/>
+      <w:headerReference w:type="even" r:id="rId8"/>
+      <w:headerReference w:type="default" r:id="rId9"/>
+      <w:footerReference w:type="even" r:id="rId10"/>
+      <w:footerReference w:type="default" r:id="rId11"/>
+      <w:headerReference w:type="first" r:id="rId12"/>
+      <w:footerReference w:type="first" r:id="rId13"/>
       <w:pgSz w:w="11906" w:h="16838"/>
       <w:pgMar w:top="1135" w:right="1134" w:bottom="993" w:left="1134" w:header="708" w:footer="314" w:gutter="0"/>
       <w:cols w:space="708"/>
@@ -1232,6 +1297,16 @@
 </file>
 
 <file path=word/footer1.xml><?xml version="1.0" encoding="utf-8"?>
+<w:ftr xmlns:wpc="http://schemas.microsoft.com/office/word/2010/wordprocessingCanvas" xmlns:cx="http://schemas.microsoft.com/office/drawing/2014/chartex" xmlns:cx1="http://schemas.microsoft.com/office/drawing/2015/9/8/chartex" xmlns:cx2="http://schemas.microsoft.com/office/drawing/2015/10/21/chartex" xmlns:cx3="http://schemas.microsoft.com/office/drawing/2016/5/9/chartex" xmlns:cx4="http://schemas.microsoft.com/office/drawing/2016/5/10/chartex" xmlns:cx5="http://schemas.microsoft.com/office/drawing/2016/5/11/chartex" xmlns:cx6="http://schemas.microsoft.com/office/drawing/2016/5/12/chartex" xmlns:cx7="http://schemas.microsoft.com/office/drawing/2016/5/13/chartex" xmlns:cx8="http://schemas.microsoft.com/office/drawing/2016/5/14/chartex" xmlns:mc="http://schemas.openxmlformats.org/markup-compatibility/2006" xmlns:aink="http://schemas.microsoft.com/office/drawing/2016/ink" xmlns:am3d="http://schemas.microsoft.com/office/drawing/2017/model3d" xmlns:o="urn:schemas-microsoft-com:office:office" xmlns:oel="http://schemas.microsoft.com/office/2019/extlst" xmlns:r="http://schemas.openxmlformats.org/officeDocument/2006/relationships" xmlns:m="http://schemas.openxmlformats.org/officeDocument/2006/math" xmlns:v="urn:schemas-microsoft-com:vml" xmlns:wp14="http://schemas.microsoft.com/office/word/2010/wordprocessingDrawing" xmlns:wp="http://schemas.openxmlformats.org/drawingml/2006/wordprocessingDrawing" xmlns:w10="urn:schemas-microsoft-com:office:word" xmlns:w="http://schemas.openxmlformats.org/wordprocessingml/2006/main" xmlns:w14="http://schemas.microsoft.com/office/word/2010/wordml" xmlns:w15="http://schemas.microsoft.com/office/word/2012/wordml" xmlns:w16cex="http://schemas.microsoft.com/office/word/2018/wordml/cex" xmlns:w16cid="http://schemas.microsoft.com/office/word/2016/wordml/cid" xmlns:w16="http://schemas.microsoft.com/office/word/2018/wordml" xmlns:w16sdtdh="http://schemas.microsoft.com/office/word/2020/wordml/sdtdatahash" xmlns:w16se="http://schemas.microsoft.com/office/word/2015/wordml/symex" xmlns:wpg="http://schemas.microsoft.com/office/word/2010/wordprocessingGroup" xmlns:wpi="http://schemas.microsoft.com/office/word/2010/wordprocessingInk" xmlns:wne="http://schemas.microsoft.com/office/word/2006/wordml" xmlns:wps="http://schemas.microsoft.com/office/word/2010/wordprocessingShape" mc:Ignorable="w14 w15 w16se w16cid w16 w16cex w16sdtdh wp14">
+  <w:p>
+    <w:pPr>
+      <w:pStyle w:val="Pidipagina"/>
+    </w:pPr>
+  </w:p>
+</w:ftr>
+</file>
+
+<file path=word/footer2.xml><?xml version="1.0" encoding="utf-8"?>
 <w:ftr xmlns:wpc="http://schemas.microsoft.com/office/word/2010/wordprocessingCanvas" xmlns:cx="http://schemas.microsoft.com/office/drawing/2014/chartex" xmlns:cx1="http://schemas.microsoft.com/office/drawing/2015/9/8/chartex" xmlns:cx2="http://schemas.microsoft.com/office/drawing/2015/10/21/chartex" xmlns:cx3="http://schemas.microsoft.com/office/drawing/2016/5/9/chartex" xmlns:cx4="http://schemas.microsoft.com/office/drawing/2016/5/10/chartex" xmlns:cx5="http://schemas.microsoft.com/office/drawing/2016/5/11/chartex" xmlns:cx6="http://schemas.microsoft.com/office/drawing/2016/5/12/chartex" xmlns:cx7="http://schemas.microsoft.com/office/drawing/2016/5/13/chartex" xmlns:cx8="http://schemas.microsoft.com/office/drawing/2016/5/14/chartex" xmlns:mc="http://schemas.openxmlformats.org/markup-compatibility/2006" xmlns:aink="http://schemas.microsoft.com/office/drawing/2016/ink" xmlns:am3d="http://schemas.microsoft.com/office/drawing/2017/model3d" xmlns:o="urn:schemas-microsoft-com:office:office" xmlns:oel="http://schemas.microsoft.com/office/2019/extlst" xmlns:r="http://schemas.openxmlformats.org/officeDocument/2006/relationships" xmlns:m="http://schemas.openxmlformats.org/officeDocument/2006/math" xmlns:v="urn:schemas-microsoft-com:vml" xmlns:wp14="http://schemas.microsoft.com/office/word/2010/wordprocessingDrawing" xmlns:wp="http://schemas.openxmlformats.org/drawingml/2006/wordprocessingDrawing" xmlns:w10="urn:schemas-microsoft-com:office:word" xmlns:w="http://schemas.openxmlformats.org/wordprocessingml/2006/main" xmlns:w14="http://schemas.microsoft.com/office/word/2010/wordml" xmlns:w15="http://schemas.microsoft.com/office/word/2012/wordml" xmlns:w16cex="http://schemas.microsoft.com/office/word/2018/wordml/cex" xmlns:w16cid="http://schemas.microsoft.com/office/word/2016/wordml/cid" xmlns:w16="http://schemas.microsoft.com/office/word/2018/wordml" xmlns:w16sdtdh="http://schemas.microsoft.com/office/word/2020/wordml/sdtdatahash" xmlns:w16se="http://schemas.microsoft.com/office/word/2015/wordml/symex" xmlns:wpg="http://schemas.microsoft.com/office/word/2010/wordprocessingGroup" xmlns:wpi="http://schemas.microsoft.com/office/word/2010/wordprocessingInk" xmlns:wne="http://schemas.microsoft.com/office/word/2006/wordml" xmlns:wps="http://schemas.microsoft.com/office/word/2010/wordprocessingShape" mc:Ignorable="w14 w15 w16se w16cid w16 w16cex w16sdtdh wp14">
   <w:p>
     <w:pPr>
@@ -1266,8 +1341,22 @@
           <w:rPr>
             <w:rFonts w:ascii="Arial" w:hAnsi="Arial" w:cs="Arial"/>
           </w:rPr>
-          <w:t xml:space="preserve"> Simulatore Treni VR</w:t>
+          <w:t xml:space="preserve"> </w:t>
         </w:r>
+        <w:r>
+          <w:rPr>
+            <w:rFonts w:ascii="Arial" w:hAnsi="Arial" w:cs="Arial"/>
+          </w:rPr>
+          <w:t xml:space="preserve">App </w:t>
+        </w:r>
+        <w:proofErr w:type="spellStart"/>
+        <w:r>
+          <w:rPr>
+            <w:rFonts w:ascii="Arial" w:hAnsi="Arial" w:cs="Arial"/>
+          </w:rPr>
+          <w:t>MyAgenda</w:t>
+        </w:r>
+        <w:proofErr w:type="spellEnd"/>
       </w:sdtContent>
     </w:sdt>
     <w:r>
@@ -1369,6 +1458,16 @@
 </w:ftr>
 </file>
 
+<file path=word/footer3.xml><?xml version="1.0" encoding="utf-8"?>
+<w:ftr xmlns:wpc="http://schemas.microsoft.com/office/word/2010/wordprocessingCanvas" xmlns:cx="http://schemas.microsoft.com/office/drawing/2014/chartex" xmlns:cx1="http://schemas.microsoft.com/office/drawing/2015/9/8/chartex" xmlns:cx2="http://schemas.microsoft.com/office/drawing/2015/10/21/chartex" xmlns:cx3="http://schemas.microsoft.com/office/drawing/2016/5/9/chartex" xmlns:cx4="http://schemas.microsoft.com/office/drawing/2016/5/10/chartex" xmlns:cx5="http://schemas.microsoft.com/office/drawing/2016/5/11/chartex" xmlns:cx6="http://schemas.microsoft.com/office/drawing/2016/5/12/chartex" xmlns:cx7="http://schemas.microsoft.com/office/drawing/2016/5/13/chartex" xmlns:cx8="http://schemas.microsoft.com/office/drawing/2016/5/14/chartex" xmlns:mc="http://schemas.openxmlformats.org/markup-compatibility/2006" xmlns:aink="http://schemas.microsoft.com/office/drawing/2016/ink" xmlns:am3d="http://schemas.microsoft.com/office/drawing/2017/model3d" xmlns:o="urn:schemas-microsoft-com:office:office" xmlns:oel="http://schemas.microsoft.com/office/2019/extlst" xmlns:r="http://schemas.openxmlformats.org/officeDocument/2006/relationships" xmlns:m="http://schemas.openxmlformats.org/officeDocument/2006/math" xmlns:v="urn:schemas-microsoft-com:vml" xmlns:wp14="http://schemas.microsoft.com/office/word/2010/wordprocessingDrawing" xmlns:wp="http://schemas.openxmlformats.org/drawingml/2006/wordprocessingDrawing" xmlns:w10="urn:schemas-microsoft-com:office:word" xmlns:w="http://schemas.openxmlformats.org/wordprocessingml/2006/main" xmlns:w14="http://schemas.microsoft.com/office/word/2010/wordml" xmlns:w15="http://schemas.microsoft.com/office/word/2012/wordml" xmlns:w16cex="http://schemas.microsoft.com/office/word/2018/wordml/cex" xmlns:w16cid="http://schemas.microsoft.com/office/word/2016/wordml/cid" xmlns:w16="http://schemas.microsoft.com/office/word/2018/wordml" xmlns:w16sdtdh="http://schemas.microsoft.com/office/word/2020/wordml/sdtdatahash" xmlns:w16se="http://schemas.microsoft.com/office/word/2015/wordml/symex" xmlns:wpg="http://schemas.microsoft.com/office/word/2010/wordprocessingGroup" xmlns:wpi="http://schemas.microsoft.com/office/word/2010/wordprocessingInk" xmlns:wne="http://schemas.microsoft.com/office/word/2006/wordml" xmlns:wps="http://schemas.microsoft.com/office/word/2010/wordprocessingShape" mc:Ignorable="w14 w15 w16se w16cid w16 w16cex w16sdtdh wp14">
+  <w:p>
+    <w:pPr>
+      <w:pStyle w:val="Pidipagina"/>
+    </w:pPr>
+  </w:p>
+</w:ftr>
+</file>
+
 <file path=word/footnotes.xml><?xml version="1.0" encoding="utf-8"?>
 <w:footnotes xmlns:wpc="http://schemas.microsoft.com/office/word/2010/wordprocessingCanvas" xmlns:cx="http://schemas.microsoft.com/office/drawing/2014/chartex" xmlns:cx1="http://schemas.microsoft.com/office/drawing/2015/9/8/chartex" xmlns:cx2="http://schemas.microsoft.com/office/drawing/2015/10/21/chartex" xmlns:cx3="http://schemas.microsoft.com/office/drawing/2016/5/9/chartex" xmlns:cx4="http://schemas.microsoft.com/office/drawing/2016/5/10/chartex" xmlns:cx5="http://schemas.microsoft.com/office/drawing/2016/5/11/chartex" xmlns:cx6="http://schemas.microsoft.com/office/drawing/2016/5/12/chartex" xmlns:cx7="http://schemas.microsoft.com/office/drawing/2016/5/13/chartex" xmlns:cx8="http://schemas.microsoft.com/office/drawing/2016/5/14/chartex" xmlns:mc="http://schemas.openxmlformats.org/markup-compatibility/2006" xmlns:aink="http://schemas.microsoft.com/office/drawing/2016/ink" xmlns:am3d="http://schemas.microsoft.com/office/drawing/2017/model3d" xmlns:o="urn:schemas-microsoft-com:office:office" xmlns:oel="http://schemas.microsoft.com/office/2019/extlst" xmlns:r="http://schemas.openxmlformats.org/officeDocument/2006/relationships" xmlns:m="http://schemas.openxmlformats.org/officeDocument/2006/math" xmlns:v="urn:schemas-microsoft-com:vml" xmlns:wp14="http://schemas.microsoft.com/office/word/2010/wordprocessingDrawing" xmlns:wp="http://schemas.openxmlformats.org/drawingml/2006/wordprocessingDrawing" xmlns:w10="urn:schemas-microsoft-com:office:word" xmlns:w="http://schemas.openxmlformats.org/wordprocessingml/2006/main" xmlns:w14="http://schemas.microsoft.com/office/word/2010/wordml" xmlns:w15="http://schemas.microsoft.com/office/word/2012/wordml" xmlns:w16cex="http://schemas.microsoft.com/office/word/2018/wordml/cex" xmlns:w16cid="http://schemas.microsoft.com/office/word/2016/wordml/cid" xmlns:w16="http://schemas.microsoft.com/office/word/2018/wordml" xmlns:w16sdtdh="http://schemas.microsoft.com/office/word/2020/wordml/sdtdatahash" xmlns:w16se="http://schemas.microsoft.com/office/word/2015/wordml/symex" xmlns:wpg="http://schemas.microsoft.com/office/word/2010/wordprocessingGroup" xmlns:wpi="http://schemas.microsoft.com/office/word/2010/wordprocessingInk" xmlns:wne="http://schemas.microsoft.com/office/word/2006/wordml" xmlns:wps="http://schemas.microsoft.com/office/word/2010/wordprocessingShape" mc:Ignorable="w14 w15 w16se w16cid w16 w16cex w16sdtdh wp14">
   <w:footnote w:type="separator" w:id="-1">
@@ -1399,6 +1498,16 @@
 </file>
 
 <file path=word/header1.xml><?xml version="1.0" encoding="utf-8"?>
+<w:hdr xmlns:wpc="http://schemas.microsoft.com/office/word/2010/wordprocessingCanvas" xmlns:cx="http://schemas.microsoft.com/office/drawing/2014/chartex" xmlns:cx1="http://schemas.microsoft.com/office/drawing/2015/9/8/chartex" xmlns:cx2="http://schemas.microsoft.com/office/drawing/2015/10/21/chartex" xmlns:cx3="http://schemas.microsoft.com/office/drawing/2016/5/9/chartex" xmlns:cx4="http://schemas.microsoft.com/office/drawing/2016/5/10/chartex" xmlns:cx5="http://schemas.microsoft.com/office/drawing/2016/5/11/chartex" xmlns:cx6="http://schemas.microsoft.com/office/drawing/2016/5/12/chartex" xmlns:cx7="http://schemas.microsoft.com/office/drawing/2016/5/13/chartex" xmlns:cx8="http://schemas.microsoft.com/office/drawing/2016/5/14/chartex" xmlns:mc="http://schemas.openxmlformats.org/markup-compatibility/2006" xmlns:aink="http://schemas.microsoft.com/office/drawing/2016/ink" xmlns:am3d="http://schemas.microsoft.com/office/drawing/2017/model3d" xmlns:o="urn:schemas-microsoft-com:office:office" xmlns:oel="http://schemas.microsoft.com/office/2019/extlst" xmlns:r="http://schemas.openxmlformats.org/officeDocument/2006/relationships" xmlns:m="http://schemas.openxmlformats.org/officeDocument/2006/math" xmlns:v="urn:schemas-microsoft-com:vml" xmlns:wp14="http://schemas.microsoft.com/office/word/2010/wordprocessingDrawing" xmlns:wp="http://schemas.openxmlformats.org/drawingml/2006/wordprocessingDrawing" xmlns:w10="urn:schemas-microsoft-com:office:word" xmlns:w="http://schemas.openxmlformats.org/wordprocessingml/2006/main" xmlns:w14="http://schemas.microsoft.com/office/word/2010/wordml" xmlns:w15="http://schemas.microsoft.com/office/word/2012/wordml" xmlns:w16cex="http://schemas.microsoft.com/office/word/2018/wordml/cex" xmlns:w16cid="http://schemas.microsoft.com/office/word/2016/wordml/cid" xmlns:w16="http://schemas.microsoft.com/office/word/2018/wordml" xmlns:w16sdtdh="http://schemas.microsoft.com/office/word/2020/wordml/sdtdatahash" xmlns:w16se="http://schemas.microsoft.com/office/word/2015/wordml/symex" xmlns:wpg="http://schemas.microsoft.com/office/word/2010/wordprocessingGroup" xmlns:wpi="http://schemas.microsoft.com/office/word/2010/wordprocessingInk" xmlns:wne="http://schemas.microsoft.com/office/word/2006/wordml" xmlns:wps="http://schemas.microsoft.com/office/word/2010/wordprocessingShape" mc:Ignorable="w14 w15 w16se w16cid w16 w16cex w16sdtdh wp14">
+  <w:p>
+    <w:pPr>
+      <w:pStyle w:val="Intestazione"/>
+    </w:pPr>
+  </w:p>
+</w:hdr>
+</file>
+
+<file path=word/header2.xml><?xml version="1.0" encoding="utf-8"?>
 <w:hdr xmlns:wpc="http://schemas.microsoft.com/office/word/2010/wordprocessingCanvas" xmlns:cx="http://schemas.microsoft.com/office/drawing/2014/chartex" xmlns:cx1="http://schemas.microsoft.com/office/drawing/2015/9/8/chartex" xmlns:cx2="http://schemas.microsoft.com/office/drawing/2015/10/21/chartex" xmlns:cx3="http://schemas.microsoft.com/office/drawing/2016/5/9/chartex" xmlns:cx4="http://schemas.microsoft.com/office/drawing/2016/5/10/chartex" xmlns:cx5="http://schemas.microsoft.com/office/drawing/2016/5/11/chartex" xmlns:cx6="http://schemas.microsoft.com/office/drawing/2016/5/12/chartex" xmlns:cx7="http://schemas.microsoft.com/office/drawing/2016/5/13/chartex" xmlns:cx8="http://schemas.microsoft.com/office/drawing/2016/5/14/chartex" xmlns:mc="http://schemas.openxmlformats.org/markup-compatibility/2006" xmlns:aink="http://schemas.microsoft.com/office/drawing/2016/ink" xmlns:am3d="http://schemas.microsoft.com/office/drawing/2017/model3d" xmlns:o="urn:schemas-microsoft-com:office:office" xmlns:oel="http://schemas.microsoft.com/office/2019/extlst" xmlns:r="http://schemas.openxmlformats.org/officeDocument/2006/relationships" xmlns:m="http://schemas.openxmlformats.org/officeDocument/2006/math" xmlns:v="urn:schemas-microsoft-com:vml" xmlns:wp14="http://schemas.microsoft.com/office/word/2010/wordprocessingDrawing" xmlns:wp="http://schemas.openxmlformats.org/drawingml/2006/wordprocessingDrawing" xmlns:w10="urn:schemas-microsoft-com:office:word" xmlns:w="http://schemas.openxmlformats.org/wordprocessingml/2006/main" xmlns:w14="http://schemas.microsoft.com/office/word/2010/wordml" xmlns:w15="http://schemas.microsoft.com/office/word/2012/wordml" xmlns:w16cex="http://schemas.microsoft.com/office/word/2018/wordml/cex" xmlns:w16cid="http://schemas.microsoft.com/office/word/2016/wordml/cid" xmlns:w16="http://schemas.microsoft.com/office/word/2018/wordml" xmlns:w16sdtdh="http://schemas.microsoft.com/office/word/2020/wordml/sdtdatahash" xmlns:w16se="http://schemas.microsoft.com/office/word/2015/wordml/symex" xmlns:wpg="http://schemas.microsoft.com/office/word/2010/wordprocessingGroup" xmlns:wpi="http://schemas.microsoft.com/office/word/2010/wordprocessingInk" xmlns:wne="http://schemas.microsoft.com/office/word/2006/wordml" xmlns:wps="http://schemas.microsoft.com/office/word/2010/wordprocessingShape" mc:Ignorable="w14 w15 w16se w16cid w16 w16cex w16sdtdh wp14">
   <w:p>
     <w:pPr>
@@ -1423,6 +1532,16 @@
       <w:t>Cognome</w:t>
     </w:r>
     <w:proofErr w:type="spellEnd"/>
+  </w:p>
+</w:hdr>
+</file>
+
+<file path=word/header3.xml><?xml version="1.0" encoding="utf-8"?>
+<w:hdr xmlns:wpc="http://schemas.microsoft.com/office/word/2010/wordprocessingCanvas" xmlns:cx="http://schemas.microsoft.com/office/drawing/2014/chartex" xmlns:cx1="http://schemas.microsoft.com/office/drawing/2015/9/8/chartex" xmlns:cx2="http://schemas.microsoft.com/office/drawing/2015/10/21/chartex" xmlns:cx3="http://schemas.microsoft.com/office/drawing/2016/5/9/chartex" xmlns:cx4="http://schemas.microsoft.com/office/drawing/2016/5/10/chartex" xmlns:cx5="http://schemas.microsoft.com/office/drawing/2016/5/11/chartex" xmlns:cx6="http://schemas.microsoft.com/office/drawing/2016/5/12/chartex" xmlns:cx7="http://schemas.microsoft.com/office/drawing/2016/5/13/chartex" xmlns:cx8="http://schemas.microsoft.com/office/drawing/2016/5/14/chartex" xmlns:mc="http://schemas.openxmlformats.org/markup-compatibility/2006" xmlns:aink="http://schemas.microsoft.com/office/drawing/2016/ink" xmlns:am3d="http://schemas.microsoft.com/office/drawing/2017/model3d" xmlns:o="urn:schemas-microsoft-com:office:office" xmlns:oel="http://schemas.microsoft.com/office/2019/extlst" xmlns:r="http://schemas.openxmlformats.org/officeDocument/2006/relationships" xmlns:m="http://schemas.openxmlformats.org/officeDocument/2006/math" xmlns:v="urn:schemas-microsoft-com:vml" xmlns:wp14="http://schemas.microsoft.com/office/word/2010/wordprocessingDrawing" xmlns:wp="http://schemas.openxmlformats.org/drawingml/2006/wordprocessingDrawing" xmlns:w10="urn:schemas-microsoft-com:office:word" xmlns:w="http://schemas.openxmlformats.org/wordprocessingml/2006/main" xmlns:w14="http://schemas.microsoft.com/office/word/2010/wordml" xmlns:w15="http://schemas.microsoft.com/office/word/2012/wordml" xmlns:w16cex="http://schemas.microsoft.com/office/word/2018/wordml/cex" xmlns:w16cid="http://schemas.microsoft.com/office/word/2016/wordml/cid" xmlns:w16="http://schemas.microsoft.com/office/word/2018/wordml" xmlns:w16sdtdh="http://schemas.microsoft.com/office/word/2020/wordml/sdtdatahash" xmlns:w16se="http://schemas.microsoft.com/office/word/2015/wordml/symex" xmlns:wpg="http://schemas.microsoft.com/office/word/2010/wordprocessingGroup" xmlns:wpi="http://schemas.microsoft.com/office/word/2010/wordprocessingInk" xmlns:wne="http://schemas.microsoft.com/office/word/2006/wordml" xmlns:wps="http://schemas.microsoft.com/office/word/2010/wordprocessingShape" mc:Ignorable="w14 w15 w16se w16cid w16 w16cex w16sdtdh wp14">
+  <w:p>
+    <w:pPr>
+      <w:pStyle w:val="Intestazione"/>
+    </w:pPr>
   </w:p>
 </w:hdr>
 </file>
@@ -2645,7 +2764,6 @@
     <w:rsidRoot w:val="00BE72BC"/>
     <w:rsid w:val="00012676"/>
     <w:rsid w:val="0002551B"/>
-    <w:rsid w:val="00025727"/>
     <w:rsid w:val="00033A44"/>
     <w:rsid w:val="0005183E"/>
     <w:rsid w:val="00066A06"/>
@@ -2785,6 +2903,7 @@
     <w:rsid w:val="00B255ED"/>
     <w:rsid w:val="00B26B07"/>
     <w:rsid w:val="00B34858"/>
+    <w:rsid w:val="00B43E9F"/>
     <w:rsid w:val="00B4671D"/>
     <w:rsid w:val="00B532B4"/>
     <w:rsid w:val="00B7646A"/>
@@ -2819,12 +2938,14 @@
     <w:rsid w:val="00DE2402"/>
     <w:rsid w:val="00DE4EBE"/>
     <w:rsid w:val="00E063DF"/>
+    <w:rsid w:val="00E2670D"/>
     <w:rsid w:val="00E31C75"/>
     <w:rsid w:val="00E52C95"/>
     <w:rsid w:val="00E67A57"/>
     <w:rsid w:val="00E738CB"/>
     <w:rsid w:val="00E91168"/>
     <w:rsid w:val="00EB6CE8"/>
+    <w:rsid w:val="00ED4285"/>
     <w:rsid w:val="00EE6084"/>
     <w:rsid w:val="00EF2002"/>
     <w:rsid w:val="00EF28DE"/>

</xml_diff>